<commit_message>
also updated uncontested_forms_content.docx to include signing_paragraph_content.docx
</commit_message>
<xml_diff>
--- a/docassemble/AKA2JBranding/data/templates/uncontested_custody_forms_content.docx
+++ b/docassemble/AKA2JBranding/data/templates/uncontested_custody_forms_content.docx
@@ -26,7 +26,7 @@
         <w:spacing w:before="280" w:after="280"/>
       </w:pPr>
       <w:r>
-        <w:t>{{ signing_paragraph }}</w:t>
+        <w:t>{{p (include_docx_template("docassemble.AKA2JBranding:signing_paragraph_content.docx")) }}</w:t>
       </w:r>
     </w:p>
     <w:p>
@@ -457,7 +457,15 @@
           <w:b/>
           <w:bCs/>
         </w:rPr>
-        <w:t>Child Support Guidelines Affidavit</w:t>
+        <w:t xml:space="preserve">Child Support Guidelines </w:t>
+      </w:r>
+      <w:r>
+        <w:rPr>
+          <w:b/>
+          <w:bCs/>
+        </w:rPr>
+        <w:lastRenderedPageBreak/>
+        <w:t>Affidavit</w:t>
       </w:r>
       <w:r>
         <w:t>.</w:t>
@@ -478,7 +486,6 @@
         <w:rPr>
           <w:b/>
         </w:rPr>
-        <w:lastRenderedPageBreak/>
         <w:t>Information Sheet</w:t>
       </w:r>
       <w:r>

</xml_diff>

<commit_message>
pasted content of signing paragraph content docx into uncontested custody forms content docx to avoid indexing error
</commit_message>
<xml_diff>
--- a/docassemble/AKA2JBranding/data/templates/uncontested_custody_forms_content.docx
+++ b/docassemble/AKA2JBranding/data/templates/uncontested_custody_forms_content.docx
@@ -23,10 +23,347 @@
     <w:p>
       <w:pPr>
         <w:pStyle w:val="Body"/>
-        <w:spacing w:before="280" w:after="280"/>
-      </w:pPr>
-      <w:r>
-        <w:t>{{p (include_docx_template("docassemble.AKA2JBranding:signing_paragraph_content.docx")) }}</w:t>
+      </w:pPr>
+    </w:p>
+    <w:p>
+      <w:pPr>
+        <w:pStyle w:val="Example"/>
+        <w:rPr>
+          <w:color w:val="auto"/>
+        </w:rPr>
+      </w:pPr>
+      <w:r>
+        <w:t>Important - signing your documents</w:t>
+      </w:r>
+    </w:p>
+    <w:p>
+      <w:pPr>
+        <w:rPr>
+          <w:rFonts w:ascii="Helvetica" w:eastAsiaTheme="minorHAnsi" w:hAnsi="Helvetica" w:cs="Helvetica"/>
+          <w:sz w:val="24"/>
+          <w:szCs w:val="24"/>
+        </w:rPr>
+      </w:pPr>
+      <w:r>
+        <w:rPr>
+          <w:rFonts w:ascii="Helvetica" w:eastAsiaTheme="minorHAnsi" w:hAnsi="Helvetica" w:cs="Helvetica"/>
+          <w:color w:val="FF0000"/>
+          <w:sz w:val="24"/>
+          <w:szCs w:val="24"/>
+        </w:rPr>
+        <w:t>{%p</w:t>
+      </w:r>
+      <w:r>
+        <w:rPr>
+          <w:rFonts w:ascii="Helvetica" w:eastAsiaTheme="minorHAnsi" w:hAnsi="Helvetica" w:cs="Helvetica"/>
+          <w:color w:val="FF0000"/>
+          <w:sz w:val="24"/>
+          <w:szCs w:val="24"/>
+        </w:rPr>
+        <w:t xml:space="preserve"> if filling_manner in('electronically', 'dunno') and filing_method in('efiling', 'dunno')</w:t>
+      </w:r>
+      <w:r>
+        <w:rPr>
+          <w:rFonts w:ascii="Helvetica" w:eastAsiaTheme="minorHAnsi" w:hAnsi="Helvetica" w:cs="Helvetica"/>
+          <w:color w:val="FF0000"/>
+          <w:sz w:val="24"/>
+          <w:szCs w:val="24"/>
+        </w:rPr>
+        <w:t xml:space="preserve"> %}</w:t>
+      </w:r>
+    </w:p>
+    <w:p>
+      <w:pPr>
+        <w:pStyle w:val="Exampleparagraph"/>
+      </w:pPr>
+      <w:r>
+        <w:t>If you fill out your forms on a computer and file them with TrueFiling, you can sign your forms electronically.  Type “/s/ your name” on the signature line. For example, Zoe Lee’s signature would be "/s/ Zoe Lee."</w:t>
+      </w:r>
+    </w:p>
+    <w:p>
+      <w:pPr>
+        <w:rPr>
+          <w:rFonts w:ascii="Helvetica" w:eastAsiaTheme="minorHAnsi" w:hAnsi="Helvetica" w:cs="Helvetica"/>
+          <w:sz w:val="24"/>
+          <w:szCs w:val="24"/>
+        </w:rPr>
+      </w:pPr>
+      <w:r>
+        <w:rPr>
+          <w:rFonts w:ascii="Helvetica" w:eastAsiaTheme="minorHAnsi" w:hAnsi="Helvetica" w:cs="Helvetica"/>
+          <w:color w:val="FFC000"/>
+          <w:sz w:val="24"/>
+          <w:szCs w:val="24"/>
+        </w:rPr>
+        <w:t>{%p</w:t>
+      </w:r>
+      <w:r>
+        <w:rPr>
+          <w:rFonts w:ascii="Helvetica" w:eastAsiaTheme="minorHAnsi" w:hAnsi="Helvetica" w:cs="Helvetica"/>
+          <w:color w:val="FFC000"/>
+          <w:sz w:val="24"/>
+          <w:szCs w:val="24"/>
+        </w:rPr>
+        <w:t xml:space="preserve"> if</w:t>
+      </w:r>
+      <w:r>
+        <w:rPr>
+          <w:rFonts w:ascii="Helvetica" w:eastAsiaTheme="minorHAnsi" w:hAnsi="Helvetica" w:cs="Helvetica"/>
+          <w:color w:val="FFC000"/>
+          <w:sz w:val="24"/>
+          <w:szCs w:val="24"/>
+        </w:rPr>
+        <w:t xml:space="preserve"> </w:t>
+      </w:r>
+      <w:r>
+        <w:rPr>
+          <w:rFonts w:ascii="Helvetica" w:eastAsiaTheme="minorHAnsi" w:hAnsi="Helvetica" w:cs="Helvetica"/>
+          <w:color w:val="FFC000"/>
+          <w:sz w:val="24"/>
+          <w:szCs w:val="24"/>
+        </w:rPr>
+        <w:t>filling_manner == 'electronically'</w:t>
+      </w:r>
+      <w:r>
+        <w:rPr>
+          <w:rFonts w:ascii="Helvetica" w:eastAsiaTheme="minorHAnsi" w:hAnsi="Helvetica" w:cs="Helvetica"/>
+          <w:color w:val="FFC000"/>
+          <w:sz w:val="24"/>
+          <w:szCs w:val="24"/>
+        </w:rPr>
+        <w:t xml:space="preserve"> and</w:t>
+      </w:r>
+      <w:r>
+        <w:rPr>
+          <w:rFonts w:ascii="Helvetica" w:eastAsiaTheme="minorHAnsi" w:hAnsi="Helvetica" w:cs="Helvetica"/>
+          <w:color w:val="FFC000"/>
+          <w:sz w:val="24"/>
+          <w:szCs w:val="24"/>
+        </w:rPr>
+        <w:t xml:space="preserve"> filing_method == 'efiling'</w:t>
+      </w:r>
+      <w:r>
+        <w:rPr>
+          <w:rFonts w:ascii="Helvetica" w:eastAsiaTheme="minorHAnsi" w:hAnsi="Helvetica" w:cs="Helvetica"/>
+          <w:color w:val="FFC000"/>
+          <w:sz w:val="24"/>
+          <w:szCs w:val="24"/>
+        </w:rPr>
+        <w:t xml:space="preserve"> %}</w:t>
+      </w:r>
+    </w:p>
+    <w:p>
+      <w:pPr>
+        <w:pStyle w:val="ExampleorImportantblock"/>
+      </w:pPr>
+      <w:r>
+        <w:t xml:space="preserve">If the form needs to be notarized, fill out and file </w:t>
+      </w:r>
+      <w:r>
+        <w:rPr>
+          <w:b/>
+          <w:bCs/>
+        </w:rPr>
+        <w:t>Self-Certification (No Notary Available), TF-835</w:t>
+      </w:r>
+      <w:r>
+        <w:t xml:space="preserve"> [</w:t>
+      </w:r>
+      <w:hyperlink r:id="rId5" w:history="1">
+        <w:r>
+          <w:rPr>
+            <w:rStyle w:val="Hyperlink"/>
+            <w:spacing w:val="0"/>
+          </w:rPr>
+          <w:t>Fill in PDF</w:t>
+        </w:r>
+      </w:hyperlink>
+      <w:r>
+        <w:t>]</w:t>
+      </w:r>
+      <w:r>
+        <w:br/>
+      </w:r>
+      <w:hyperlink r:id="rId6" w:history="1">
+        <w:r>
+          <w:rPr>
+            <w:rStyle w:val="Hyperlink"/>
+            <w:spacing w:val="0"/>
+          </w:rPr>
+          <w:t>ak-courts.info/tf835</w:t>
+        </w:r>
+      </w:hyperlink>
+      <w:r>
+        <w:t>.</w:t>
+      </w:r>
+    </w:p>
+    <w:p>
+      <w:pPr>
+        <w:rPr>
+          <w:rFonts w:ascii="Helvetica" w:eastAsiaTheme="minorHAnsi" w:hAnsi="Helvetica" w:cs="Helvetica"/>
+          <w:sz w:val="24"/>
+          <w:szCs w:val="24"/>
+        </w:rPr>
+      </w:pPr>
+      <w:r>
+        <w:rPr>
+          <w:rFonts w:ascii="Helvetica" w:eastAsiaTheme="minorHAnsi" w:hAnsi="Helvetica" w:cs="Helvetica"/>
+          <w:color w:val="FFC000"/>
+          <w:sz w:val="24"/>
+          <w:szCs w:val="24"/>
+        </w:rPr>
+        <w:t>{%p</w:t>
+      </w:r>
+      <w:r>
+        <w:rPr>
+          <w:rFonts w:ascii="Helvetica" w:eastAsiaTheme="minorHAnsi" w:hAnsi="Helvetica" w:cs="Helvetica"/>
+          <w:color w:val="FFC000"/>
+          <w:sz w:val="24"/>
+          <w:szCs w:val="24"/>
+        </w:rPr>
+        <w:t xml:space="preserve"> endi</w:t>
+      </w:r>
+      <w:r>
+        <w:rPr>
+          <w:rFonts w:ascii="Helvetica" w:eastAsiaTheme="minorHAnsi" w:hAnsi="Helvetica" w:cs="Helvetica"/>
+          <w:color w:val="FFC000"/>
+          <w:sz w:val="24"/>
+          <w:szCs w:val="24"/>
+        </w:rPr>
+        <w:t>f %}</w:t>
+      </w:r>
+    </w:p>
+    <w:p>
+      <w:pPr>
+        <w:rPr>
+          <w:rFonts w:ascii="Helvetica" w:eastAsiaTheme="minorHAnsi" w:hAnsi="Helvetica" w:cs="Helvetica"/>
+          <w:sz w:val="24"/>
+          <w:szCs w:val="24"/>
+        </w:rPr>
+      </w:pPr>
+      <w:r>
+        <w:rPr>
+          <w:rFonts w:ascii="Helvetica" w:eastAsiaTheme="minorHAnsi" w:hAnsi="Helvetica" w:cs="Helvetica"/>
+          <w:color w:val="FF0000"/>
+          <w:sz w:val="24"/>
+          <w:szCs w:val="24"/>
+        </w:rPr>
+        <w:t>{%p</w:t>
+      </w:r>
+      <w:r>
+        <w:rPr>
+          <w:rFonts w:ascii="Helvetica" w:eastAsiaTheme="minorHAnsi" w:hAnsi="Helvetica" w:cs="Helvetica"/>
+          <w:color w:val="FF0000"/>
+          <w:sz w:val="24"/>
+          <w:szCs w:val="24"/>
+        </w:rPr>
+        <w:t xml:space="preserve"> endi</w:t>
+      </w:r>
+      <w:r>
+        <w:rPr>
+          <w:rFonts w:ascii="Helvetica" w:eastAsiaTheme="minorHAnsi" w:hAnsi="Helvetica" w:cs="Helvetica"/>
+          <w:color w:val="FF0000"/>
+          <w:sz w:val="24"/>
+          <w:szCs w:val="24"/>
+        </w:rPr>
+        <w:t>f %}</w:t>
+      </w:r>
+    </w:p>
+    <w:p>
+      <w:pPr>
+        <w:rPr>
+          <w:rFonts w:ascii="Helvetica" w:eastAsiaTheme="minorHAnsi" w:hAnsi="Helvetica" w:cs="Helvetica"/>
+          <w:sz w:val="24"/>
+          <w:szCs w:val="24"/>
+        </w:rPr>
+      </w:pPr>
+      <w:r>
+        <w:rPr>
+          <w:rFonts w:ascii="Helvetica" w:eastAsiaTheme="minorHAnsi" w:hAnsi="Helvetica" w:cs="Helvetica"/>
+          <w:color w:val="FF0000"/>
+          <w:sz w:val="24"/>
+          <w:szCs w:val="24"/>
+        </w:rPr>
+        <w:t>{%p</w:t>
+      </w:r>
+      <w:r>
+        <w:rPr>
+          <w:rFonts w:ascii="Helvetica" w:eastAsiaTheme="minorHAnsi" w:hAnsi="Helvetica" w:cs="Helvetica"/>
+          <w:color w:val="FF0000"/>
+          <w:sz w:val="24"/>
+          <w:szCs w:val="24"/>
+        </w:rPr>
+        <w:t xml:space="preserve"> if filling_manner in('paper', 'dunno') or filing_method in ('mail or in person', 'dunno'</w:t>
+      </w:r>
+      <w:r>
+        <w:rPr>
+          <w:rFonts w:ascii="Helvetica" w:eastAsiaTheme="minorHAnsi" w:hAnsi="Helvetica" w:cs="Helvetica"/>
+          <w:color w:val="FF0000"/>
+          <w:sz w:val="24"/>
+          <w:szCs w:val="24"/>
+        </w:rPr>
+        <w:t>) %}</w:t>
+      </w:r>
+    </w:p>
+    <w:p>
+      <w:r>
+        <w:t>If you fill out paper copies of the forms, or do not file them with TrueFiling, read</w:t>
+      </w:r>
+      <w:r>
+        <w:t xml:space="preserve"> the step “</w:t>
+      </w:r>
+      <w:r>
+        <w:t>Sign if you use paper forms or do not use TrueFiling</w:t>
+      </w:r>
+      <w:r>
+        <w:t>”</w:t>
+      </w:r>
+    </w:p>
+    <w:p>
+      <w:r>
+        <w:rPr>
+          <w:rFonts w:ascii="Helvetica" w:eastAsiaTheme="minorHAnsi" w:hAnsi="Helvetica" w:cs="Helvetica"/>
+          <w:color w:val="FF0000"/>
+          <w:sz w:val="24"/>
+          <w:szCs w:val="24"/>
+        </w:rPr>
+        <w:t>{%p</w:t>
+      </w:r>
+      <w:r>
+        <w:rPr>
+          <w:rFonts w:ascii="Helvetica" w:eastAsiaTheme="minorHAnsi" w:hAnsi="Helvetica" w:cs="Helvetica"/>
+          <w:color w:val="FF0000"/>
+          <w:sz w:val="24"/>
+          <w:szCs w:val="24"/>
+        </w:rPr>
+        <w:t xml:space="preserve"> </w:t>
+      </w:r>
+      <w:r>
+        <w:rPr>
+          <w:rFonts w:ascii="Helvetica" w:eastAsiaTheme="minorHAnsi" w:hAnsi="Helvetica" w:cs="Helvetica"/>
+          <w:color w:val="FF0000"/>
+          <w:sz w:val="24"/>
+          <w:szCs w:val="24"/>
+        </w:rPr>
+        <w:t>end</w:t>
+      </w:r>
+      <w:r>
+        <w:rPr>
+          <w:rFonts w:ascii="Helvetica" w:eastAsiaTheme="minorHAnsi" w:hAnsi="Helvetica" w:cs="Helvetica"/>
+          <w:color w:val="FF0000"/>
+          <w:sz w:val="24"/>
+          <w:szCs w:val="24"/>
+        </w:rPr>
+        <w:t>if</w:t>
+      </w:r>
+      <w:r>
+        <w:rPr>
+          <w:rFonts w:ascii="Helvetica" w:eastAsiaTheme="minorHAnsi" w:hAnsi="Helvetica" w:cs="Helvetica"/>
+          <w:color w:val="FF0000"/>
+          <w:sz w:val="24"/>
+          <w:szCs w:val="24"/>
+        </w:rPr>
+        <w:t xml:space="preserve"> %}</w:t>
       </w:r>
     </w:p>
     <w:p>
@@ -66,7 +403,7 @@
         </w:rPr>
         <w:t xml:space="preserve"> [</w:t>
       </w:r>
-      <w:hyperlink r:id="rId5" w:history="1">
+      <w:hyperlink r:id="rId7" w:history="1">
         <w:r>
           <w:rPr>
             <w:rStyle w:val="Hyperlink"/>
@@ -93,7 +430,7 @@
         </w:rPr>
         <w:br/>
       </w:r>
-      <w:hyperlink r:id="rId6" w:history="1">
+      <w:hyperlink r:id="rId8" w:history="1">
         <w:r>
           <w:rPr>
             <w:rStyle w:val="Hyperlink"/>
@@ -123,7 +460,11 @@
         </w:numPr>
       </w:pPr>
       <w:r>
-        <w:t>In the caption, print your name above “Plaintiff” and the other parent’s name above “Defendant.”</w:t>
+        <w:t xml:space="preserve">In the caption, print your name above “Plaintiff” and the other parent’s name above </w:t>
+      </w:r>
+      <w:r>
+        <w:lastRenderedPageBreak/>
+        <w:t>“Defendant.”</w:t>
       </w:r>
     </w:p>
     <w:p>
@@ -158,7 +499,7 @@
         </w:rPr>
         <w:t>[</w:t>
       </w:r>
-      <w:hyperlink r:id="rId7" w:history="1">
+      <w:hyperlink r:id="rId9" w:history="1">
         <w:r>
           <w:rPr>
             <w:rStyle w:val="Hyperlink"/>
@@ -179,7 +520,7 @@
         </w:rPr>
         <w:br/>
       </w:r>
-      <w:hyperlink r:id="rId8" w:history="1">
+      <w:hyperlink r:id="rId10" w:history="1">
         <w:r>
           <w:rPr>
             <w:rStyle w:val="Hyperlink"/>
@@ -209,7 +550,7 @@
         </w:rPr>
         <w:t xml:space="preserve">, </w:t>
       </w:r>
-      <w:hyperlink r:id="rId9">
+      <w:hyperlink r:id="rId11">
         <w:r>
           <w:rPr>
             <w:rStyle w:val="Hyperlink"/>
@@ -226,7 +567,7 @@
         </w:rPr>
         <w:t xml:space="preserve"> [</w:t>
       </w:r>
-      <w:hyperlink r:id="rId10" w:history="1">
+      <w:hyperlink r:id="rId12" w:history="1">
         <w:r>
           <w:rPr>
             <w:rStyle w:val="Hyperlink"/>
@@ -248,7 +589,7 @@
         </w:rPr>
         <w:br/>
       </w:r>
-      <w:hyperlink r:id="rId11" w:history="1">
+      <w:hyperlink r:id="rId13" w:history="1">
         <w:r>
           <w:rPr>
             <w:rStyle w:val="Hyperlink"/>
@@ -295,7 +636,7 @@
         </w:rPr>
         <w:t xml:space="preserve"> [</w:t>
       </w:r>
-      <w:hyperlink r:id="rId12" w:history="1">
+      <w:hyperlink r:id="rId14" w:history="1">
         <w:r>
           <w:rPr>
             <w:rStyle w:val="Hyperlink"/>
@@ -355,7 +696,7 @@
         </w:rPr>
         <w:t>[</w:t>
       </w:r>
-      <w:hyperlink r:id="rId13" w:history="1">
+      <w:hyperlink r:id="rId15" w:history="1">
         <w:r>
           <w:rPr>
             <w:rStyle w:val="Hyperlink"/>
@@ -388,7 +729,7 @@
         </w:rPr>
         <w:br/>
       </w:r>
-      <w:hyperlink r:id="rId14" w:history="1">
+      <w:hyperlink r:id="rId16" w:history="1">
         <w:r>
           <w:rPr>
             <w:rStyle w:val="Hyperlink"/>
@@ -421,7 +762,7 @@
       <w:r>
         <w:t xml:space="preserve">See </w:t>
       </w:r>
-      <w:hyperlink r:id="rId15">
+      <w:hyperlink r:id="rId17">
         <w:r>
           <w:rPr>
             <w:rStyle w:val="Hyperlink"/>
@@ -432,7 +773,7 @@
       <w:r>
         <w:br/>
       </w:r>
-      <w:hyperlink r:id="rId16" w:history="1">
+      <w:hyperlink r:id="rId18" w:history="1">
         <w:r>
           <w:rPr>
             <w:rStyle w:val="Hyperlink"/>
@@ -457,15 +798,7 @@
           <w:b/>
           <w:bCs/>
         </w:rPr>
-        <w:t xml:space="preserve">Child Support Guidelines </w:t>
-      </w:r>
-      <w:r>
-        <w:rPr>
-          <w:b/>
-          <w:bCs/>
-        </w:rPr>
-        <w:lastRenderedPageBreak/>
-        <w:t>Affidavit</w:t>
+        <w:t>Child Support Guidelines Affidavit</w:t>
       </w:r>
       <w:r>
         <w:t>.</w:t>
@@ -499,146 +832,6 @@
           <w:bCs/>
         </w:rPr>
         <w:t xml:space="preserve"> [</w:t>
-      </w:r>
-      <w:hyperlink r:id="rId17" w:history="1">
-        <w:r>
-          <w:rPr>
-            <w:rStyle w:val="Hyperlink"/>
-            <w:bCs/>
-          </w:rPr>
-          <w:t>Fill-In PDF</w:t>
-        </w:r>
-      </w:hyperlink>
-      <w:r>
-        <w:rPr>
-          <w:bCs/>
-        </w:rPr>
-        <w:t>]</w:t>
-      </w:r>
-      <w:r>
-        <w:rPr>
-          <w:b/>
-        </w:rPr>
-        <w:t xml:space="preserve"> </w:t>
-      </w:r>
-      <w:r>
-        <w:rPr>
-          <w:b/>
-        </w:rPr>
-        <w:br/>
-      </w:r>
-      <w:hyperlink r:id="rId18" w:history="1">
-        <w:r>
-          <w:rPr>
-            <w:rStyle w:val="Hyperlink"/>
-            <w:bCs/>
-          </w:rPr>
-          <w:t>ak-courts.info/dr314</w:t>
-        </w:r>
-      </w:hyperlink>
-      <w:r>
-        <w:rPr>
-          <w:bCs/>
-        </w:rPr>
-        <w:t xml:space="preserve"> </w:t>
-      </w:r>
-      <w:r>
-        <w:rPr>
-          <w:bCs/>
-        </w:rPr>
-        <w:br/>
-        <w:t>Fill in 1-3 with complete information for yourself, the children in the case, {{ other_party_in_case }} if you know it, and then sign and date</w:t>
-      </w:r>
-      <w:r>
-        <w:rPr>
-          <w:bCs/>
-        </w:rPr>
-        <w:t xml:space="preserve"> the form</w:t>
-      </w:r>
-      <w:r>
-        <w:rPr>
-          <w:bCs/>
-        </w:rPr>
-        <w:t>.</w:t>
-      </w:r>
-    </w:p>
-    <w:p>
-      <w:pPr>
-        <w:pStyle w:val="Heading3"/>
-      </w:pPr>
-      <w:r>
-        <w:t>Optional forms depending on your situation</w:t>
-      </w:r>
-    </w:p>
-    <w:p>
-      <w:pPr>
-        <w:pStyle w:val="ListParagraph"/>
-        <w:numPr>
-          <w:ilvl w:val="0"/>
-          <w:numId w:val="45"/>
-        </w:numPr>
-        <w:rPr>
-          <w:sz w:val="25"/>
-          <w:szCs w:val="25"/>
-          <w:u w:val="single"/>
-        </w:rPr>
-      </w:pPr>
-      <w:r>
-        <w:rPr>
-          <w:b/>
-        </w:rPr>
-        <w:t>Choose</w:t>
-      </w:r>
-      <w:r>
-        <w:rPr>
-          <w:sz w:val="25"/>
-          <w:szCs w:val="25"/>
-        </w:rPr>
-        <w:t xml:space="preserve"> </w:t>
-      </w:r>
-      <w:r>
-        <w:t>1 form based on the parenting schedule if it is not a primary custody calculation (where children are with 1 parent for at least 256 overnights/year</w:t>
-      </w:r>
-      <w:r>
-        <w:rPr>
-          <w:sz w:val="25"/>
-          <w:szCs w:val="25"/>
-          <w:u w:val="single"/>
-        </w:rPr>
-        <w:t>)</w:t>
-      </w:r>
-    </w:p>
-    <w:p>
-      <w:pPr>
-        <w:pStyle w:val="ListParagraph"/>
-        <w:numPr>
-          <w:ilvl w:val="0"/>
-          <w:numId w:val="45"/>
-        </w:numPr>
-        <w:rPr>
-          <w:color w:val="000000"/>
-        </w:rPr>
-      </w:pPr>
-      <w:r>
-        <w:rPr>
-          <w:b/>
-          <w:color w:val="000000"/>
-        </w:rPr>
-        <w:t>Shared Custody Support Calculation</w:t>
-      </w:r>
-      <w:r>
-        <w:rPr>
-          <w:b/>
-          <w:color w:val="000000"/>
-        </w:rPr>
-        <w:t>, DR-306</w:t>
-      </w:r>
-      <w:r>
-        <w:rPr>
-          <w:bCs/>
-          <w:color w:val="000000"/>
-        </w:rPr>
-        <w:t>, [</w:t>
       </w:r>
       <w:hyperlink r:id="rId19" w:history="1">
         <w:r>
@@ -652,18 +845,158 @@
       <w:r>
         <w:rPr>
           <w:bCs/>
+        </w:rPr>
+        <w:t>]</w:t>
+      </w:r>
+      <w:r>
+        <w:rPr>
+          <w:b/>
+        </w:rPr>
+        <w:t xml:space="preserve"> </w:t>
+      </w:r>
+      <w:r>
+        <w:rPr>
+          <w:b/>
+        </w:rPr>
+        <w:br/>
+      </w:r>
+      <w:hyperlink r:id="rId20" w:history="1">
+        <w:r>
+          <w:rPr>
+            <w:rStyle w:val="Hyperlink"/>
+            <w:bCs/>
+          </w:rPr>
+          <w:t>ak-courts.info/dr314</w:t>
+        </w:r>
+      </w:hyperlink>
+      <w:r>
+        <w:rPr>
+          <w:bCs/>
+        </w:rPr>
+        <w:t xml:space="preserve"> </w:t>
+      </w:r>
+      <w:r>
+        <w:rPr>
+          <w:bCs/>
+        </w:rPr>
+        <w:br/>
+        <w:t>Fill in 1-3 with complete information for yourself, the children in the case, {{ other_party_in_case }} if you know it, and then sign and date</w:t>
+      </w:r>
+      <w:r>
+        <w:rPr>
+          <w:bCs/>
+        </w:rPr>
+        <w:t xml:space="preserve"> the form</w:t>
+      </w:r>
+      <w:r>
+        <w:rPr>
+          <w:bCs/>
+        </w:rPr>
+        <w:t>.</w:t>
+      </w:r>
+    </w:p>
+    <w:p>
+      <w:pPr>
+        <w:pStyle w:val="Heading3"/>
+      </w:pPr>
+      <w:r>
+        <w:t>Optional forms depending on your situation</w:t>
+      </w:r>
+    </w:p>
+    <w:p>
+      <w:pPr>
+        <w:pStyle w:val="ListParagraph"/>
+        <w:numPr>
+          <w:ilvl w:val="0"/>
+          <w:numId w:val="45"/>
+        </w:numPr>
+        <w:rPr>
+          <w:sz w:val="25"/>
+          <w:szCs w:val="25"/>
+          <w:u w:val="single"/>
+        </w:rPr>
+      </w:pPr>
+      <w:r>
+        <w:rPr>
+          <w:b/>
+        </w:rPr>
+        <w:t>Choose</w:t>
+      </w:r>
+      <w:r>
+        <w:rPr>
+          <w:sz w:val="25"/>
+          <w:szCs w:val="25"/>
+        </w:rPr>
+        <w:t xml:space="preserve"> </w:t>
+      </w:r>
+      <w:r>
+        <w:t>1 form based on the parenting schedule if it is not a primary custody calculation (where children are with 1 parent for at least 256 overnights/year</w:t>
+      </w:r>
+      <w:r>
+        <w:rPr>
+          <w:sz w:val="25"/>
+          <w:szCs w:val="25"/>
+          <w:u w:val="single"/>
+        </w:rPr>
+        <w:t>)</w:t>
+      </w:r>
+    </w:p>
+    <w:p>
+      <w:pPr>
+        <w:pStyle w:val="ListParagraph"/>
+        <w:numPr>
+          <w:ilvl w:val="0"/>
+          <w:numId w:val="45"/>
+        </w:numPr>
+        <w:rPr>
           <w:color w:val="000000"/>
         </w:rPr>
-        <w:t>]</w:t>
+      </w:pPr>
+      <w:r>
+        <w:rPr>
+          <w:b/>
+          <w:color w:val="000000"/>
+        </w:rPr>
+        <w:t>Shared Custody Support Calculation</w:t>
+      </w:r>
+      <w:r>
+        <w:rPr>
+          <w:b/>
+          <w:color w:val="000000"/>
+        </w:rPr>
+        <w:t>, DR-306</w:t>
       </w:r>
       <w:r>
         <w:rPr>
           <w:bCs/>
           <w:color w:val="000000"/>
         </w:rPr>
+        <w:t>, [</w:t>
+      </w:r>
+      <w:hyperlink r:id="rId21" w:history="1">
+        <w:r>
+          <w:rPr>
+            <w:rStyle w:val="Hyperlink"/>
+            <w:bCs/>
+          </w:rPr>
+          <w:t>Fill-In PDF</w:t>
+        </w:r>
+      </w:hyperlink>
+      <w:r>
+        <w:rPr>
+          <w:bCs/>
+          <w:color w:val="000000"/>
+        </w:rPr>
+        <w:t>]</w:t>
+      </w:r>
+      <w:r>
+        <w:rPr>
+          <w:bCs/>
+          <w:color w:val="000000"/>
+        </w:rPr>
         <w:br/>
       </w:r>
-      <w:hyperlink r:id="rId20" w:history="1">
+      <w:hyperlink r:id="rId22" w:history="1">
         <w:r>
           <w:rPr>
             <w:rStyle w:val="Hyperlink"/>
@@ -709,7 +1042,7 @@
         </w:rPr>
         <w:t>[</w:t>
       </w:r>
-      <w:hyperlink r:id="rId21" w:history="1">
+      <w:hyperlink r:id="rId23" w:history="1">
         <w:r>
           <w:rPr>
             <w:rStyle w:val="Hyperlink"/>
@@ -732,7 +1065,7 @@
         </w:rPr>
         <w:br/>
       </w:r>
-      <w:hyperlink r:id="rId22" w:history="1">
+      <w:hyperlink r:id="rId24" w:history="1">
         <w:r>
           <w:rPr>
             <w:rStyle w:val="Hyperlink"/>
@@ -781,7 +1114,7 @@
         </w:rPr>
         <w:t xml:space="preserve"> [</w:t>
       </w:r>
-      <w:hyperlink r:id="rId23" w:history="1">
+      <w:hyperlink r:id="rId25" w:history="1">
         <w:r>
           <w:rPr>
             <w:rStyle w:val="Hyperlink"/>
@@ -807,7 +1140,7 @@
         </w:rPr>
         <w:br/>
       </w:r>
-      <w:hyperlink r:id="rId24" w:history="1">
+      <w:hyperlink r:id="rId26" w:history="1">
         <w:r>
           <w:rPr>
             <w:rStyle w:val="Hyperlink"/>
@@ -842,7 +1175,7 @@
       <w:r>
         <w:t xml:space="preserve"> [</w:t>
       </w:r>
-      <w:hyperlink r:id="rId25" w:history="1">
+      <w:hyperlink r:id="rId27" w:history="1">
         <w:r>
           <w:rPr>
             <w:rStyle w:val="Hyperlink"/>
@@ -856,7 +1189,7 @@
       <w:r>
         <w:br/>
       </w:r>
-      <w:hyperlink r:id="rId26" w:history="1">
+      <w:hyperlink r:id="rId28" w:history="1">
         <w:r>
           <w:rPr>
             <w:rStyle w:val="Hyperlink"/>

</xml_diff>